<commit_message>
ci(deploy): configure GitHub Pages workflow, Vite base path, CORS, and hosting specifications
</commit_message>
<xml_diff>
--- a/docs/PROJECT_REPORT.docx
+++ b/docs/PROJECT_REPORT.docx
@@ -158,6 +158,30 @@
           <w:szCs w:val="22"/>
         </w:rPr>
         <w:t xml:space="preserve">• Date of Submission: [DATE OF SUBMISSION]</w:t>
+      </w:r>
+    </w:p>
+    <w:p>
+      <w:pPr>
+        <w:spacing w:after="100"/>
+      </w:pPr>
+      <w:r>
+        <w:rPr>
+          <w:sz w:val="22"/>
+          <w:szCs w:val="22"/>
+        </w:rPr>
+        <w:t xml:space="preserve">• GitHub Repository: https://github.com/Tamil-k-iniyan/Campus-Event-Registration-</w:t>
+      </w:r>
+    </w:p>
+    <w:p>
+      <w:pPr>
+        <w:spacing w:after="100"/>
+      </w:pPr>
+      <w:r>
+        <w:rPr>
+          <w:sz w:val="22"/>
+          <w:szCs w:val="22"/>
+        </w:rPr>
+        <w:t xml:space="preserve">• Live Website URL: https://tamil-k-iniyan.github.io/Campus-Event-Registration-/</w:t>
       </w:r>
     </w:p>
     <w:p>

</xml_diff>